<commit_message>
Added a couple of units of mesaurement; fixed graphic
</commit_message>
<xml_diff>
--- a/physics/first_term/labs/lab1/report.docx
+++ b/physics/first_term/labs/lab1/report.docx
@@ -17070,10 +17070,10 @@
           <w:color w:val="000000" w:themeColor="text1"/>
         </w:rPr>
         <w:drawing>
-          <wp:inline distT="0" distB="0" distL="0" distR="0" wp14:anchorId="0E8A879F" wp14:editId="7F5C6A6F">
-            <wp:extent cx="6482080" cy="2919730"/>
-            <wp:effectExtent l="0" t="0" r="0" b="1270"/>
-            <wp:docPr id="1935400653" name="Рисунок 3" descr="Изображение выглядит как линия, График, число, диаграмма&#10;&#10;Содержимое, созданное искусственным интеллектом, может быть неверным."/>
+          <wp:inline distT="0" distB="0" distL="0" distR="0" wp14:anchorId="1C68FC24" wp14:editId="43FD52F5">
+            <wp:extent cx="6482080" cy="2913380"/>
+            <wp:effectExtent l="0" t="0" r="0" b="0"/>
+            <wp:docPr id="895611129" name="Picture 1" descr="A graph with a line graph&#10;&#10;AI-generated content may be incorrect."/>
             <wp:cNvGraphicFramePr>
               <a:graphicFrameLocks xmlns:a="http://schemas.openxmlformats.org/drawingml/2006/main" noChangeAspect="1"/>
             </wp:cNvGraphicFramePr>
@@ -17081,7 +17081,7 @@
               <a:graphicData uri="http://schemas.openxmlformats.org/drawingml/2006/picture">
                 <pic:pic xmlns:pic="http://schemas.openxmlformats.org/drawingml/2006/picture">
                   <pic:nvPicPr>
-                    <pic:cNvPr id="1935400653" name="Рисунок 3" descr="Изображение выглядит как линия, График, число, диаграмма&#10;&#10;Содержимое, созданное искусственным интеллектом, может быть неверным."/>
+                    <pic:cNvPr id="895611129" name="Picture 1" descr="A graph with a line graph&#10;&#10;AI-generated content may be incorrect."/>
                     <pic:cNvPicPr/>
                   </pic:nvPicPr>
                   <pic:blipFill>
@@ -17099,7 +17099,7 @@
                   <pic:spPr>
                     <a:xfrm>
                       <a:off x="0" y="0"/>
-                      <a:ext cx="6482080" cy="2919730"/>
+                      <a:ext cx="6482080" cy="2913380"/>
                     </a:xfrm>
                     <a:prstGeom prst="rect">
                       <a:avLst/>

</xml_diff>

<commit_message>
added unit of measurement
</commit_message>
<xml_diff>
--- a/physics/first_term/labs/lab1/report.docx
+++ b/physics/first_term/labs/lab1/report.docx
@@ -10771,6 +10771,7 @@
               <w:rPr>
                 <w:rFonts w:ascii="Aptos Narrow" w:hAnsi="Aptos Narrow"/>
                 <w:color w:val="000000" w:themeColor="text1"/>
+                <w:lang w:val="en-US"/>
               </w:rPr>
             </w:pPr>
             <m:oMath>
@@ -10824,6 +10825,33 @@
                 <w:lang w:val="en-US"/>
               </w:rPr>
               <w:t xml:space="preserve">, </w:t>
+            </w:r>
+            <w:r>
+              <w:rPr>
+                <w:b/>
+                <w:bCs/>
+                <w:i/>
+                <w:iCs/>
+                <w:color w:val="000000" w:themeColor="text1"/>
+              </w:rPr>
+              <w:t>◦</w:t>
+            </w:r>
+            <w:r>
+              <w:rPr>
+                <w:i/>
+                <w:color w:val="000000" w:themeColor="text1"/>
+                <w:vertAlign w:val="superscript"/>
+              </w:rPr>
+              <w:t>-</w:t>
+            </w:r>
+            <w:r>
+              <w:rPr>
+                <w:i/>
+                <w:color w:val="000000" w:themeColor="text1"/>
+                <w:vertAlign w:val="superscript"/>
+                <w:lang w:val="en-US"/>
+              </w:rPr>
+              <w:t>1</w:t>
             </w:r>
           </w:p>
         </w:tc>
@@ -17900,6 +17928,7 @@
         <w:spacing w:before="160"/>
         <w:rPr>
           <w:color w:val="000000" w:themeColor="text1"/>
+          <w:lang w:val="en-US"/>
         </w:rPr>
       </w:pPr>
     </w:p>
@@ -17908,12 +17937,22 @@
         <w:spacing w:before="160"/>
         <w:rPr>
           <w:color w:val="000000" w:themeColor="text1"/>
-        </w:rPr>
-      </w:pPr>
-      <w:r>
-        <w:rPr>
-          <w:color w:val="000000" w:themeColor="text1"/>
-        </w:rPr>
+          <w:lang w:val="en-US"/>
+        </w:rPr>
+      </w:pPr>
+    </w:p>
+    <w:p>
+      <w:pPr>
+        <w:spacing w:before="160"/>
+        <w:rPr>
+          <w:color w:val="000000" w:themeColor="text1"/>
+        </w:rPr>
+      </w:pPr>
+      <w:r>
+        <w:rPr>
+          <w:color w:val="000000" w:themeColor="text1"/>
+        </w:rPr>
+        <w:lastRenderedPageBreak/>
         <w:t>13. Выводы и анализ результатов работы.</w:t>
       </w:r>
     </w:p>
@@ -17937,7 +17976,6 @@
           <w:iCs w:val="0"/>
           <w:color w:val="000000" w:themeColor="text1"/>
         </w:rPr>
-        <w:lastRenderedPageBreak/>
         <w:t>Анализ распределения</w:t>
       </w:r>
       <w:r>
@@ -18463,14 +18501,7 @@
         <w:spacing w:before="160"/>
         <w:rPr>
           <w:color w:val="000000" w:themeColor="text1"/>
-        </w:rPr>
-      </w:pPr>
-    </w:p>
-    <w:p>
-      <w:pPr>
-        <w:spacing w:before="160"/>
-        <w:rPr>
-          <w:color w:val="000000" w:themeColor="text1"/>
+          <w:lang w:val="en-US"/>
         </w:rPr>
       </w:pPr>
     </w:p>
@@ -18787,14 +18818,7 @@
         <w:spacing w:before="160"/>
         <w:rPr>
           <w:color w:val="000000" w:themeColor="text1"/>
-        </w:rPr>
-      </w:pPr>
-    </w:p>
-    <w:p>
-      <w:pPr>
-        <w:spacing w:before="160"/>
-        <w:rPr>
-          <w:color w:val="000000" w:themeColor="text1"/>
+          <w:lang w:val="en-US"/>
         </w:rPr>
       </w:pPr>
     </w:p>
@@ -19028,6 +19052,7 @@
                 <w:color w:val="000000" w:themeColor="text1"/>
                 <w:sz w:val="22"/>
                 <w:szCs w:val="22"/>
+                <w:lang w:val="en-US"/>
               </w:rPr>
             </w:pPr>
           </w:p>
@@ -19068,6 +19093,7 @@
         <w:spacing w:before="160"/>
         <w:rPr>
           <w:color w:val="000000" w:themeColor="text1"/>
+          <w:lang w:val="en-US"/>
         </w:rPr>
       </w:pPr>
     </w:p>

</xml_diff>